<commit_message>
Add student IDs of all group members to the report
</commit_message>
<xml_diff>
--- a/FinalReport/Group6_Platform_Driver_Report.docx
+++ b/FinalReport/Group6_Platform_Driver_Report.docx
@@ -562,6 +562,13 @@
               <w:spacing w:line="252" w:lineRule="auto"/>
               <w:jc w:val="center"/>
             </w:pPr>
+            <w:r>
+              <w:rPr>
+                <w:sz w:val="24"/>
+                <w:szCs w:val="24"/>
+              </w:rPr>
+              <w:t>24119051</w:t>
+            </w:r>
           </w:p>
         </w:tc>
         <w:tc>
@@ -691,6 +698,13 @@
               <w:spacing w:line="252" w:lineRule="auto"/>
               <w:jc w:val="center"/>
             </w:pPr>
+            <w:r>
+              <w:rPr>
+                <w:sz w:val="24"/>
+                <w:szCs w:val="24"/>
+              </w:rPr>
+              <w:t>24119039</w:t>
+            </w:r>
           </w:p>
         </w:tc>
         <w:tc>

</xml_diff>